<commit_message>
fix: drop tagline, de-slop site copy, regenerate general resume
- Remove "Raw in. Trusted out." from site, CSS, and brand board
- Rewrite bullets and about copy: no em dashes, filler, or cliches
- Add Disney and Transitions to general resume; trim to 2 pages

Co-Authored-By: Claude Opus 5.5 <noreply@anthropic.com>
</commit_message>
<xml_diff>
--- a/resumes/general.docx
+++ b/resumes/general.docx
@@ -4,14 +4,15 @@
   <w:body>
     <w:p>
       <w:pPr>
-        <w:spacing w:after="40"/>
+        <w:pStyle w:val="Heading1"/>
+        <w:spacing w:before="0" w:after="40"/>
         <w:jc w:val="center"/>
       </w:pPr>
       <w:r>
         <w:rPr>
-          <w:rFonts w:ascii="Calibri" w:hAnsi="Calibri"/>
+          <w:rFonts w:ascii="Calibri" w:hAnsi="Calibri" w:eastAsia="Calibri" w:cs="Calibri"/>
           <w:b/>
-          <w:color w:val="2F4B4F"/>
+          <w:color w:val="000000"/>
           <w:sz w:val="40"/>
         </w:rPr>
         <w:t>Barry Babbitt</w:t>
@@ -19,90 +20,136 @@
     </w:p>
     <w:p>
       <w:pPr>
-        <w:spacing w:after="80"/>
+        <w:spacing w:before="0" w:after="60"/>
         <w:jc w:val="center"/>
       </w:pPr>
       <w:r>
         <w:rPr>
-          <w:rFonts w:ascii="Calibri" w:hAnsi="Calibri"/>
+          <w:rFonts w:ascii="Calibri" w:hAnsi="Calibri" w:eastAsia="Calibri" w:cs="Calibri"/>
+          <w:b w:val="0"/>
+          <w:color w:val="000000"/>
           <w:sz w:val="20"/>
         </w:rPr>
-        <w:t>Orlando, FL</w:t>
+        <w:t xml:space="preserve">Orlando, FL  |  </w:t>
       </w:r>
+      <w:hyperlink r:id="rId9">
+        <w:r>
+          <w:rPr>
+            <w:rStyle w:val="Hyperlink"/>
+            <w:rFonts w:ascii="Calibri" w:hAnsi="Calibri" w:eastAsia="Calibri" w:cs="Calibri"/>
+            <w:sz w:val="20"/>
+            <w:color w:val="2F4B4F"/>
+            <w:u w:val="none"/>
+          </w:rPr>
+          <w:t xml:space="preserve">babbitt.barry@gmail.com</w:t>
+        </w:r>
+      </w:hyperlink>
       <w:r>
         <w:rPr>
-          <w:rFonts w:ascii="Calibri" w:hAnsi="Calibri"/>
-          <w:color w:val="8FAFB0"/>
+          <w:rFonts w:ascii="Calibri" w:hAnsi="Calibri" w:eastAsia="Calibri" w:cs="Calibri"/>
+          <w:b w:val="0"/>
+          <w:color w:val="000000"/>
           <w:sz w:val="20"/>
         </w:rPr>
         <w:t xml:space="preserve">  |  </w:t>
       </w:r>
       <w:r>
         <w:rPr>
-          <w:rFonts w:ascii="Calibri" w:hAnsi="Calibri"/>
-          <w:sz w:val="20"/>
-        </w:rPr>
-        <w:t>babbitt.barry@gmail.com</w:t>
-      </w:r>
-      <w:r>
-        <w:rPr>
-          <w:rFonts w:ascii="Calibri" w:hAnsi="Calibri"/>
-          <w:color w:val="8FAFB0"/>
-          <w:sz w:val="20"/>
-        </w:rPr>
-        <w:t xml:space="preserve">  |  </w:t>
-      </w:r>
-      <w:r>
-        <w:rPr>
-          <w:rFonts w:ascii="Calibri" w:hAnsi="Calibri"/>
+          <w:rFonts w:ascii="Calibri" w:hAnsi="Calibri" w:eastAsia="Calibri" w:cs="Calibri"/>
+          <w:b w:val="0"/>
+          <w:color w:val="000000"/>
           <w:sz w:val="20"/>
         </w:rPr>
         <w:t>407-451-3979</w:t>
       </w:r>
       <w:r>
         <w:rPr>
-          <w:rFonts w:ascii="Calibri" w:hAnsi="Calibri"/>
-          <w:color w:val="8FAFB0"/>
+          <w:rFonts w:ascii="Calibri" w:hAnsi="Calibri" w:eastAsia="Calibri" w:cs="Calibri"/>
+          <w:b w:val="0"/>
+          <w:color w:val="000000"/>
           <w:sz w:val="20"/>
         </w:rPr>
         <w:t xml:space="preserve">  |  </w:t>
       </w:r>
+      <w:hyperlink r:id="rId10">
+        <w:r>
+          <w:rPr>
+            <w:rStyle w:val="Hyperlink"/>
+            <w:rFonts w:ascii="Calibri" w:hAnsi="Calibri" w:eastAsia="Calibri" w:cs="Calibri"/>
+            <w:sz w:val="20"/>
+            <w:color w:val="2F4B4F"/>
+            <w:u w:val="none"/>
+          </w:rPr>
+          <w:t xml:space="preserve">linkedin.com/in/barrybabbitt1</w:t>
+        </w:r>
+      </w:hyperlink>
       <w:r>
         <w:rPr>
-          <w:rFonts w:ascii="Calibri" w:hAnsi="Calibri"/>
-          <w:sz w:val="20"/>
-        </w:rPr>
-        <w:t>linkedin.com/in/barrybabbitt1</w:t>
-      </w:r>
-      <w:r>
-        <w:rPr>
-          <w:rFonts w:ascii="Calibri" w:hAnsi="Calibri"/>
-          <w:color w:val="8FAFB0"/>
+          <w:rFonts w:ascii="Calibri" w:hAnsi="Calibri" w:eastAsia="Calibri" w:cs="Calibri"/>
+          <w:b w:val="0"/>
+          <w:color w:val="000000"/>
           <w:sz w:val="20"/>
         </w:rPr>
         <w:t xml:space="preserve">  |  </w:t>
       </w:r>
-      <w:r>
-        <w:rPr>
-          <w:rFonts w:ascii="Calibri" w:hAnsi="Calibri"/>
-          <w:sz w:val="20"/>
-        </w:rPr>
-        <w:t>bbabbitt1.github.io/portfolio</w:t>
-      </w:r>
+      <w:hyperlink r:id="rId11">
+        <w:r>
+          <w:rPr>
+            <w:rStyle w:val="Hyperlink"/>
+            <w:rFonts w:ascii="Calibri" w:hAnsi="Calibri" w:eastAsia="Calibri" w:cs="Calibri"/>
+            <w:sz w:val="20"/>
+            <w:color w:val="2F4B4F"/>
+            <w:u w:val="none"/>
+          </w:rPr>
+          <w:t xml:space="preserve">bbabbitt1.github.io/portfolio</w:t>
+        </w:r>
+      </w:hyperlink>
     </w:p>
     <w:p>
       <w:pPr>
-        <w:keepNext/>
-        <w:spacing w:before="200" w:after="80"/>
+        <w:pStyle w:val="Heading2"/>
+        <w:spacing w:before="200" w:after="80" w:line="260" w:lineRule="atLeast"/>
         <w:pBdr>
           <w:bottom w:val="single" w:sz="4" w:space="1" w:color="2F4B4F"/>
         </w:pBdr>
       </w:pPr>
       <w:r>
         <w:rPr>
-          <w:rFonts w:ascii="Calibri" w:hAnsi="Calibri"/>
+          <w:rFonts w:ascii="Calibri" w:hAnsi="Calibri" w:eastAsia="Calibri" w:cs="Calibri"/>
           <w:b/>
-          <w:color w:val="2F4B4F"/>
+          <w:color w:val="000000"/>
+          <w:sz w:val="24"/>
+        </w:rPr>
+        <w:t>PROFESSIONAL SUMMARY</w:t>
+      </w:r>
+    </w:p>
+    <w:p>
+      <w:pPr>
+        <w:spacing w:before="0" w:after="60" w:line="260" w:lineRule="atLeast"/>
+      </w:pPr>
+      <w:r>
+        <w:rPr>
+          <w:rFonts w:ascii="Calibri" w:hAnsi="Calibri" w:eastAsia="Calibri" w:cs="Calibri"/>
+          <w:b w:val="0"/>
+          <w:color w:val="000000"/>
+          <w:sz w:val="20"/>
+        </w:rPr>
+        <w:t>Analytics and data engineer who designs dimensional models and builds the pipelines and apps that run on them. Ships production work on Azure, AWS, and Snowflake, from API ingestion through Power BI semantic models and full-stack web apps.</w:t>
+      </w:r>
+    </w:p>
+    <w:p>
+      <w:pPr>
+        <w:pStyle w:val="Heading2"/>
+        <w:spacing w:before="200" w:after="80" w:line="260" w:lineRule="atLeast"/>
+        <w:pBdr>
+          <w:bottom w:val="single" w:sz="4" w:space="1" w:color="2F4B4F"/>
+        </w:pBdr>
+      </w:pPr>
+      <w:r>
+        <w:rPr>
+          <w:rFonts w:ascii="Calibri" w:hAnsi="Calibri" w:eastAsia="Calibri" w:cs="Calibri"/>
+          <w:b/>
+          <w:color w:val="000000"/>
           <w:sz w:val="24"/>
         </w:rPr>
         <w:t>SKILLS</w:t>
@@ -110,39 +157,45 @@
     </w:p>
     <w:p>
       <w:pPr>
-        <w:spacing w:after="20" w:before="0"/>
+        <w:spacing w:before="0" w:after="20" w:line="260" w:lineRule="atLeast"/>
       </w:pPr>
       <w:r>
         <w:rPr>
-          <w:rFonts w:ascii="Calibri" w:hAnsi="Calibri"/>
+          <w:rFonts w:ascii="Calibri" w:hAnsi="Calibri" w:eastAsia="Calibri" w:cs="Calibri"/>
           <w:b/>
+          <w:color w:val="000000"/>
           <w:sz w:val="20"/>
         </w:rPr>
         <w:t xml:space="preserve">Programming: </w:t>
       </w:r>
       <w:r>
         <w:rPr>
-          <w:rFonts w:ascii="Calibri" w:hAnsi="Calibri"/>
+          <w:rFonts w:ascii="Calibri" w:hAnsi="Calibri" w:eastAsia="Calibri" w:cs="Calibri"/>
+          <w:b w:val="0"/>
+          <w:color w:val="000000"/>
           <w:sz w:val="20"/>
         </w:rPr>
-        <w:t>SQL, Python, M, DAX, VBA, C#, Office Scripts, HTML, CSS, JavaScript</w:t>
+        <w:t>SQL, Python, TypeScript, React, Node.js, M, DAX, C#, HTML, CSS, JavaScript</w:t>
       </w:r>
     </w:p>
     <w:p>
       <w:pPr>
-        <w:spacing w:after="20" w:before="0"/>
+        <w:spacing w:before="0" w:after="20" w:line="260" w:lineRule="atLeast"/>
       </w:pPr>
       <w:r>
         <w:rPr>
-          <w:rFonts w:ascii="Calibri" w:hAnsi="Calibri"/>
+          <w:rFonts w:ascii="Calibri" w:hAnsi="Calibri" w:eastAsia="Calibri" w:cs="Calibri"/>
           <w:b/>
+          <w:color w:val="000000"/>
           <w:sz w:val="20"/>
         </w:rPr>
         <w:t xml:space="preserve">Cloud &amp; Warehousing: </w:t>
       </w:r>
       <w:r>
         <w:rPr>
-          <w:rFonts w:ascii="Calibri" w:hAnsi="Calibri"/>
+          <w:rFonts w:ascii="Calibri" w:hAnsi="Calibri" w:eastAsia="Calibri" w:cs="Calibri"/>
+          <w:b w:val="0"/>
+          <w:color w:val="000000"/>
           <w:sz w:val="20"/>
         </w:rPr>
         <w:t>AWS (S3, Lambda, DMS, Kinesis, ECR), Azure (Functions, SQL), Snowflake, BigQuery</w:t>
@@ -150,19 +203,22 @@
     </w:p>
     <w:p>
       <w:pPr>
-        <w:spacing w:after="20" w:before="0"/>
+        <w:spacing w:before="0" w:after="20" w:line="260" w:lineRule="atLeast"/>
       </w:pPr>
       <w:r>
         <w:rPr>
-          <w:rFonts w:ascii="Calibri" w:hAnsi="Calibri"/>
+          <w:rFonts w:ascii="Calibri" w:hAnsi="Calibri" w:eastAsia="Calibri" w:cs="Calibri"/>
           <w:b/>
+          <w:color w:val="000000"/>
           <w:sz w:val="20"/>
         </w:rPr>
         <w:t xml:space="preserve">Data Engineering: </w:t>
       </w:r>
       <w:r>
         <w:rPr>
-          <w:rFonts w:ascii="Calibri" w:hAnsi="Calibri"/>
+          <w:rFonts w:ascii="Calibri" w:hAnsi="Calibri" w:eastAsia="Calibri" w:cs="Calibri"/>
+          <w:b w:val="0"/>
+          <w:color w:val="000000"/>
           <w:sz w:val="20"/>
         </w:rPr>
         <w:t>ETL/ELT pipelines, schema evolution, SCD1/SCD2, streaming data, data lakehouse, CI/CD (GitLab/GitHub)</w:t>
@@ -170,19 +226,45 @@
     </w:p>
     <w:p>
       <w:pPr>
-        <w:spacing w:after="20" w:before="0"/>
+        <w:spacing w:before="0" w:after="20" w:line="260" w:lineRule="atLeast"/>
       </w:pPr>
       <w:r>
         <w:rPr>
-          <w:rFonts w:ascii="Calibri" w:hAnsi="Calibri"/>
+          <w:rFonts w:ascii="Calibri" w:hAnsi="Calibri" w:eastAsia="Calibri" w:cs="Calibri"/>
           <w:b/>
+          <w:color w:val="000000"/>
+          <w:sz w:val="20"/>
+        </w:rPr>
+        <w:t xml:space="preserve">Application Development: </w:t>
+      </w:r>
+      <w:r>
+        <w:rPr>
+          <w:rFonts w:ascii="Calibri" w:hAnsi="Calibri" w:eastAsia="Calibri" w:cs="Calibri"/>
+          <w:b w:val="0"/>
+          <w:color w:val="000000"/>
+          <w:sz w:val="20"/>
+        </w:rPr>
+        <w:t>React, Express, JWT authentication, PWA (Workbox, IndexedDB), REST API design, Zod validation</w:t>
+      </w:r>
+    </w:p>
+    <w:p>
+      <w:pPr>
+        <w:spacing w:before="0" w:after="20" w:line="260" w:lineRule="atLeast"/>
+      </w:pPr>
+      <w:r>
+        <w:rPr>
+          <w:rFonts w:ascii="Calibri" w:hAnsi="Calibri" w:eastAsia="Calibri" w:cs="Calibri"/>
+          <w:b/>
+          <w:color w:val="000000"/>
           <w:sz w:val="20"/>
         </w:rPr>
         <w:t xml:space="preserve">Analytics &amp; BI: </w:t>
       </w:r>
       <w:r>
         <w:rPr>
-          <w:rFonts w:ascii="Calibri" w:hAnsi="Calibri"/>
+          <w:rFonts w:ascii="Calibri" w:hAnsi="Calibri" w:eastAsia="Calibri" w:cs="Calibri"/>
+          <w:b w:val="0"/>
+          <w:color w:val="000000"/>
           <w:sz w:val="20"/>
         </w:rPr>
         <w:t>Power BI, Power Query, Power Automate, Excel, Azure Data Studio, dbt, Erwin Data Modeler</w:t>
@@ -190,19 +272,22 @@
     </w:p>
     <w:p>
       <w:pPr>
-        <w:spacing w:after="20" w:before="0"/>
+        <w:spacing w:before="0" w:after="20" w:line="260" w:lineRule="atLeast"/>
       </w:pPr>
       <w:r>
         <w:rPr>
-          <w:rFonts w:ascii="Calibri" w:hAnsi="Calibri"/>
+          <w:rFonts w:ascii="Calibri" w:hAnsi="Calibri" w:eastAsia="Calibri" w:cs="Calibri"/>
           <w:b/>
+          <w:color w:val="000000"/>
           <w:sz w:val="20"/>
         </w:rPr>
         <w:t xml:space="preserve">Data Architecture: </w:t>
       </w:r>
       <w:r>
         <w:rPr>
-          <w:rFonts w:ascii="Calibri" w:hAnsi="Calibri"/>
+          <w:rFonts w:ascii="Calibri" w:hAnsi="Calibri" w:eastAsia="Calibri" w:cs="Calibri"/>
+          <w:b w:val="0"/>
+          <w:color w:val="000000"/>
           <w:sz w:val="20"/>
         </w:rPr>
         <w:t>Star schemas, dimensional modeling, conceptual/logical/physical models, grain alignment</w:t>
@@ -210,19 +295,22 @@
     </w:p>
     <w:p>
       <w:pPr>
-        <w:spacing w:after="20" w:before="0"/>
+        <w:spacing w:before="0" w:after="20" w:line="260" w:lineRule="atLeast"/>
       </w:pPr>
       <w:r>
         <w:rPr>
-          <w:rFonts w:ascii="Calibri" w:hAnsi="Calibri"/>
+          <w:rFonts w:ascii="Calibri" w:hAnsi="Calibri" w:eastAsia="Calibri" w:cs="Calibri"/>
           <w:b/>
+          <w:color w:val="000000"/>
           <w:sz w:val="20"/>
         </w:rPr>
-        <w:t xml:space="preserve">SQL Server: </w:t>
+        <w:t xml:space="preserve">SQL Server (Advanced): </w:t>
       </w:r>
       <w:r>
         <w:rPr>
-          <w:rFonts w:ascii="Calibri" w:hAnsi="Calibri"/>
+          <w:rFonts w:ascii="Calibri" w:hAnsi="Calibri" w:eastAsia="Calibri" w:cs="Calibri"/>
+          <w:b w:val="0"/>
+          <w:color w:val="000000"/>
           <w:sz w:val="20"/>
         </w:rPr>
         <w:t>Relational modeling, CTE-heavy transformations, window functions, stored procedures, views</w:t>
@@ -230,19 +318,22 @@
     </w:p>
     <w:p>
       <w:pPr>
-        <w:spacing w:after="20" w:before="0"/>
+        <w:spacing w:before="0" w:after="20" w:line="260" w:lineRule="atLeast"/>
       </w:pPr>
       <w:r>
         <w:rPr>
-          <w:rFonts w:ascii="Calibri" w:hAnsi="Calibri"/>
+          <w:rFonts w:ascii="Calibri" w:hAnsi="Calibri" w:eastAsia="Calibri" w:cs="Calibri"/>
           <w:b/>
+          <w:color w:val="000000"/>
           <w:sz w:val="20"/>
         </w:rPr>
         <w:t xml:space="preserve">API Integration: </w:t>
       </w:r>
       <w:r>
         <w:rPr>
-          <w:rFonts w:ascii="Calibri" w:hAnsi="Calibri"/>
+          <w:rFonts w:ascii="Calibri" w:hAnsi="Calibri" w:eastAsia="Calibri" w:cs="Calibri"/>
+          <w:b w:val="0"/>
+          <w:color w:val="000000"/>
           <w:sz w:val="20"/>
         </w:rPr>
         <w:t>REST API consumption, deeply nested JSON flattening (Python, C#), SQLAlchemy</w:t>
@@ -250,19 +341,22 @@
     </w:p>
     <w:p>
       <w:pPr>
-        <w:spacing w:after="20" w:before="0"/>
+        <w:spacing w:before="0" w:after="20" w:line="260" w:lineRule="atLeast"/>
       </w:pPr>
       <w:r>
         <w:rPr>
-          <w:rFonts w:ascii="Calibri" w:hAnsi="Calibri"/>
+          <w:rFonts w:ascii="Calibri" w:hAnsi="Calibri" w:eastAsia="Calibri" w:cs="Calibri"/>
           <w:b/>
+          <w:color w:val="000000"/>
           <w:sz w:val="20"/>
         </w:rPr>
         <w:t xml:space="preserve">Frameworks: </w:t>
       </w:r>
       <w:r>
         <w:rPr>
-          <w:rFonts w:ascii="Calibri" w:hAnsi="Calibri"/>
+          <w:rFonts w:ascii="Calibri" w:hAnsi="Calibri" w:eastAsia="Calibri" w:cs="Calibri"/>
+          <w:b w:val="0"/>
+          <w:color w:val="000000"/>
           <w:sz w:val="20"/>
         </w:rPr>
         <w:t>Agile/Scrum, A/B Testing, canonical schemas (ISO 20022)</w:t>
@@ -270,17 +364,17 @@
     </w:p>
     <w:p>
       <w:pPr>
-        <w:keepNext/>
-        <w:spacing w:before="200" w:after="80"/>
+        <w:pStyle w:val="Heading2"/>
+        <w:spacing w:before="200" w:after="80" w:line="260" w:lineRule="atLeast"/>
         <w:pBdr>
           <w:bottom w:val="single" w:sz="4" w:space="1" w:color="2F4B4F"/>
         </w:pBdr>
       </w:pPr>
       <w:r>
         <w:rPr>
-          <w:rFonts w:ascii="Calibri" w:hAnsi="Calibri"/>
+          <w:rFonts w:ascii="Calibri" w:hAnsi="Calibri" w:eastAsia="Calibri" w:cs="Calibri"/>
           <w:b/>
-          <w:color w:val="2F4B4F"/>
+          <w:color w:val="000000"/>
           <w:sz w:val="24"/>
         </w:rPr>
         <w:t>EXPERIENCE</w:t>
@@ -288,195 +382,324 @@
     </w:p>
     <w:p>
       <w:pPr>
-        <w:keepNext/>
-        <w:spacing w:before="160" w:after="0"/>
+        <w:spacing w:before="120" w:after="0" w:line="260" w:lineRule="atLeast"/>
       </w:pPr>
       <w:r>
         <w:rPr>
-          <w:rFonts w:ascii="Calibri" w:hAnsi="Calibri"/>
+          <w:rFonts w:ascii="Calibri" w:hAnsi="Calibri" w:eastAsia="Calibri" w:cs="Calibri"/>
           <w:b/>
+          <w:color w:val="000000"/>
           <w:sz w:val="21"/>
         </w:rPr>
-        <w:t>Senior Data Analyst — BNY (Data Modeling &amp; Governance)</w:t>
+        <w:t>Senior Business Analyst, Disney (Analytics Suite Engineering)</w:t>
       </w:r>
     </w:p>
     <w:p>
       <w:pPr>
-        <w:keepNext/>
-        <w:spacing w:before="0" w:after="40"/>
+        <w:spacing w:before="0" w:after="20" w:line="260" w:lineRule="atLeast"/>
       </w:pPr>
       <w:r>
         <w:rPr>
-          <w:rFonts w:ascii="Calibri" w:hAnsi="Calibri"/>
+          <w:rFonts w:ascii="Calibri" w:hAnsi="Calibri" w:eastAsia="Calibri" w:cs="Calibri"/>
+          <w:b w:val="0"/>
           <w:i/>
+          <w:color w:val="000000"/>
           <w:sz w:val="20"/>
         </w:rPr>
-        <w:t>Lake Mary, FL | March 2025 – Present</w:t>
+        <w:t>Orlando, FL | September 2026 – Present</w:t>
       </w:r>
     </w:p>
     <w:p>
       <w:pPr>
         <w:pStyle w:val="ListBullet"/>
-        <w:spacing w:after="40" w:before="0"/>
-        <w:ind w:left="360"/>
+        <w:spacing w:before="0" w:after="20" w:line="260" w:lineRule="atLeast"/>
       </w:pPr>
       <w:r>
         <w:rPr>
-          <w:rFonts w:ascii="Calibri" w:hAnsi="Calibri"/>
+          <w:rFonts w:ascii="Calibri" w:hAnsi="Calibri" w:eastAsia="Calibri" w:cs="Calibri"/>
+          <w:b w:val="0"/>
+          <w:color w:val="000000"/>
           <w:sz w:val="20"/>
         </w:rPr>
-        <w:t>Architected a centralized metadata and data-dictionary platform by integrating GitLab and SharePoint APIs, establishing a single source of truth across 15+ enterprise datasets and 2,000+ attributes.</w:t>
+        <w:t>Building a full-stack web app that brings the internal analytics suite into one product for business users.</w:t>
       </w:r>
     </w:p>
     <w:p>
       <w:pPr>
         <w:pStyle w:val="ListBullet"/>
-        <w:spacing w:after="40" w:before="0"/>
-        <w:ind w:left="360"/>
+        <w:spacing w:before="0" w:after="20" w:line="260" w:lineRule="atLeast"/>
       </w:pPr>
       <w:r>
         <w:rPr>
-          <w:rFonts w:ascii="Calibri" w:hAnsi="Calibri"/>
+          <w:rFonts w:ascii="Calibri" w:hAnsi="Calibri" w:eastAsia="Calibri" w:cs="Calibri"/>
+          <w:b w:val="0"/>
+          <w:color w:val="000000"/>
           <w:sz w:val="20"/>
         </w:rPr>
-        <w:t>Designed relational metadata models linking datasets, attributes, schema versions, and certification status, enabling attribute-level lineage and schema impact analysis at enterprise scale.</w:t>
+        <w:t>Turning recurring BI and reporting requests into self-service features in the app.</w:t>
+      </w:r>
+    </w:p>
+    <w:p>
+      <w:pPr>
+        <w:spacing w:before="120" w:after="0" w:line="260" w:lineRule="atLeast"/>
+      </w:pPr>
+      <w:r>
+        <w:rPr>
+          <w:rFonts w:ascii="Calibri" w:hAnsi="Calibri" w:eastAsia="Calibri" w:cs="Calibri"/>
+          <w:b/>
+          <w:color w:val="000000"/>
+          <w:sz w:val="21"/>
+        </w:rPr>
+        <w:t>Senior Data Analyst, Transitions (Reporting Automation &amp; Data Governance)</w:t>
+      </w:r>
+    </w:p>
+    <w:p>
+      <w:pPr>
+        <w:spacing w:before="0" w:after="20" w:line="260" w:lineRule="atLeast"/>
+      </w:pPr>
+      <w:r>
+        <w:rPr>
+          <w:rFonts w:ascii="Calibri" w:hAnsi="Calibri" w:eastAsia="Calibri" w:cs="Calibri"/>
+          <w:b w:val="0"/>
+          <w:i/>
+          <w:color w:val="000000"/>
+          <w:sz w:val="20"/>
+        </w:rPr>
+        <w:t>Orlando, FL | May 2026 – September 2026</w:t>
       </w:r>
     </w:p>
     <w:p>
       <w:pPr>
         <w:pStyle w:val="ListBullet"/>
-        <w:spacing w:after="40" w:before="0"/>
-        <w:ind w:left="360"/>
+        <w:spacing w:before="0" w:after="20" w:line="260" w:lineRule="atLeast"/>
       </w:pPr>
       <w:r>
         <w:rPr>
-          <w:rFonts w:ascii="Calibri" w:hAnsi="Calibri"/>
+          <w:rFonts w:ascii="Calibri" w:hAnsi="Calibri" w:eastAsia="Calibri" w:cs="Calibri"/>
+          <w:b w:val="0"/>
+          <w:color w:val="000000"/>
           <w:sz w:val="20"/>
         </w:rPr>
-        <w:t>Built a CI/CD pipeline that validates, version-controls, and promotes documentation artifacts through environments, reducing schema-change turnaround from days to hours.</w:t>
+        <w:t>Led a full redesign of the Power BI semantic model, improving data quality and cutting refresh time from 9s to 3s.</w:t>
       </w:r>
     </w:p>
     <w:p>
       <w:pPr>
         <w:pStyle w:val="ListBullet"/>
-        <w:spacing w:after="40" w:before="0"/>
-        <w:ind w:left="360"/>
+        <w:spacing w:before="0" w:after="20" w:line="260" w:lineRule="atLeast"/>
       </w:pPr>
       <w:r>
         <w:rPr>
-          <w:rFonts w:ascii="Calibri" w:hAnsi="Calibri"/>
+          <w:rFonts w:ascii="Calibri" w:hAnsi="Calibri" w:eastAsia="Calibri" w:cs="Calibri"/>
+          <w:b w:val="0"/>
+          <w:color w:val="000000"/>
           <w:sz w:val="20"/>
         </w:rPr>
-        <w:t>Authored complex SQL transformations using multi-layer CTEs and window functions to construct analytical fact and dimension tables from heterogeneous financial sources.</w:t>
-      </w:r>
-    </w:p>
-    <w:p>
-      <w:pPr>
-        <w:keepNext/>
-        <w:spacing w:before="160" w:after="0"/>
-      </w:pPr>
-      <w:r>
-        <w:rPr>
-          <w:rFonts w:ascii="Calibri" w:hAnsi="Calibri"/>
-          <w:b/>
-          <w:sz w:val="21"/>
-        </w:rPr>
-        <w:t>Freelance Data Analyst &amp; Data Engineer — Self Employed</w:t>
-      </w:r>
-    </w:p>
-    <w:p>
-      <w:pPr>
-        <w:keepNext/>
-        <w:spacing w:before="0" w:after="40"/>
-      </w:pPr>
-      <w:r>
-        <w:rPr>
-          <w:rFonts w:ascii="Calibri" w:hAnsi="Calibri"/>
-          <w:i/>
-          <w:sz w:val="20"/>
-        </w:rPr>
-        <w:t>Orlando, FL | March 2025 – Present</w:t>
+        <w:t>Built and owned a Python reporting platform that runs 9+ manual data pulls from one command, with validation, logging, and a report-freshness dashboard. It replaced a multi-hour weekly routine.</w:t>
       </w:r>
     </w:p>
     <w:p>
       <w:pPr>
         <w:pStyle w:val="ListBullet"/>
-        <w:spacing w:after="40" w:before="0"/>
-        <w:ind w:left="360"/>
+        <w:spacing w:before="0" w:after="20" w:line="260" w:lineRule="atLeast"/>
       </w:pPr>
       <w:r>
         <w:rPr>
-          <w:rFonts w:ascii="Calibri" w:hAnsi="Calibri"/>
+          <w:rFonts w:ascii="Calibri" w:hAnsi="Calibri" w:eastAsia="Calibri" w:cs="Calibri"/>
+          <w:b w:val="0"/>
+          <w:color w:val="000000"/>
           <w:sz w:val="20"/>
         </w:rPr>
-        <w:t>Engineered a production data pipeline integrating Tekla PowerFab APIs (C#) with Python ETL workflows and AWS S3, automating ingestion of fabrication metrics into SQL Server for a steel manufacturing client.</w:t>
+        <w:t>Extracted a 115-tab, 22MB trended P&amp;L workbook into a self-reconciling budget fact table, checking each line item against the workbook’s subtotals and ending monthly manual re-keying.</w:t>
       </w:r>
     </w:p>
     <w:p>
       <w:pPr>
         <w:pStyle w:val="ListBullet"/>
-        <w:spacing w:after="40" w:before="0"/>
-        <w:ind w:left="360"/>
+        <w:spacing w:before="0" w:after="20" w:line="260" w:lineRule="atLeast"/>
       </w:pPr>
       <w:r>
         <w:rPr>
-          <w:rFonts w:ascii="Calibri" w:hAnsi="Calibri"/>
+          <w:rFonts w:ascii="Calibri" w:hAnsi="Calibri" w:eastAsia="Calibri" w:cs="Calibri"/>
+          <w:b w:val="0"/>
+          <w:color w:val="000000"/>
           <w:sz w:val="20"/>
         </w:rPr>
-        <w:t>Built a serverless ETL pipeline (Azure Functions, Python) extracting putting stroke data from Blast Motion's REST API, loading incrementally into Azure SQL via high-watermark pattern and idempotent upserts, with Power Automate mobile orchestration and Power BI dashboard tracking 9 stroke metrics.</w:t>
+        <w:t>Automated per-site report distribution for 11 site leaders via the Power BI REST API and generated PowerPoint decks, cutting hours of manual assembly each pay period.</w:t>
       </w:r>
     </w:p>
     <w:p>
       <w:pPr>
         <w:pStyle w:val="ListBullet"/>
-        <w:spacing w:after="40" w:before="0"/>
-        <w:ind w:left="360"/>
+        <w:spacing w:before="0" w:after="20" w:line="260" w:lineRule="atLeast"/>
       </w:pPr>
       <w:r>
         <w:rPr>
-          <w:rFonts w:ascii="Calibri" w:hAnsi="Calibri"/>
+          <w:rFonts w:ascii="Calibri" w:hAnsi="Calibri" w:eastAsia="Calibri" w:cs="Calibri"/>
+          <w:b w:val="0"/>
+          <w:color w:val="000000"/>
           <w:sz w:val="20"/>
         </w:rPr>
-        <w:t>Delivered a Power BI dashboard providing leadership with historical production trends, improving operational decision-making around staffing and resource allocation.</w:t>
+        <w:t>Set up data governance: per-table data dictionaries with a controlled key vocabulary, a type/length canon across warehouses for spotting drift, and a published metric glossary.</w:t>
+      </w:r>
+    </w:p>
+    <w:p>
+      <w:pPr>
+        <w:spacing w:before="120" w:after="0" w:line="260" w:lineRule="atLeast"/>
+      </w:pPr>
+      <w:r>
+        <w:rPr>
+          <w:rFonts w:ascii="Calibri" w:hAnsi="Calibri" w:eastAsia="Calibri" w:cs="Calibri"/>
+          <w:b/>
+          <w:color w:val="000000"/>
+          <w:sz w:val="21"/>
+        </w:rPr>
+        <w:t>Senior Data Analyst, BNY (Enterprise Data Modeling &amp; Governance)</w:t>
+      </w:r>
+    </w:p>
+    <w:p>
+      <w:pPr>
+        <w:spacing w:before="0" w:after="20" w:line="260" w:lineRule="atLeast"/>
+      </w:pPr>
+      <w:r>
+        <w:rPr>
+          <w:rFonts w:ascii="Calibri" w:hAnsi="Calibri" w:eastAsia="Calibri" w:cs="Calibri"/>
+          <w:b w:val="0"/>
+          <w:i/>
+          <w:color w:val="000000"/>
+          <w:sz w:val="20"/>
+        </w:rPr>
+        <w:t>Lake Mary, FL | March 2025 – April 2026</w:t>
       </w:r>
     </w:p>
     <w:p>
       <w:pPr>
         <w:pStyle w:val="ListBullet"/>
-        <w:spacing w:after="40" w:before="0"/>
-        <w:ind w:left="360"/>
+        <w:spacing w:before="0" w:after="20" w:line="260" w:lineRule="atLeast"/>
       </w:pPr>
       <w:r>
         <w:rPr>
-          <w:rFonts w:ascii="Calibri" w:hAnsi="Calibri"/>
+          <w:rFonts w:ascii="Calibri" w:hAnsi="Calibri" w:eastAsia="Calibri" w:cs="Calibri"/>
+          <w:b w:val="0"/>
+          <w:color w:val="000000"/>
           <w:sz w:val="20"/>
         </w:rPr>
-        <w:t>Implemented Type 2 SCD tracking with dbt + Snowflake across 2M+ records, supporting compliance and longitudinal analysis.</w:t>
+        <w:t>Architected a metadata and data-dictionary platform with GitLab and SharePoint API integrations, documenting 15+ enterprise datasets and 2,000+ attributes in one place.</w:t>
       </w:r>
     </w:p>
     <w:p>
       <w:pPr>
-        <w:keepNext/>
-        <w:spacing w:before="160" w:after="0"/>
+        <w:pStyle w:val="ListBullet"/>
+        <w:spacing w:before="0" w:after="20" w:line="260" w:lineRule="atLeast"/>
       </w:pPr>
       <w:r>
         <w:rPr>
-          <w:rFonts w:ascii="Calibri" w:hAnsi="Calibri"/>
-          <w:b/>
-          <w:sz w:val="21"/>
+          <w:rFonts w:ascii="Calibri" w:hAnsi="Calibri" w:eastAsia="Calibri" w:cs="Calibri"/>
+          <w:b w:val="0"/>
+          <w:color w:val="000000"/>
+          <w:sz w:val="20"/>
         </w:rPr>
-        <w:t>Senior Data Analyst — MasterCorp</w:t>
+        <w:t>Built a GitLab CI/CD pipeline that validates, versions, and promotes documentation through environments, cutting schema-change turnaround from days to hours.</w:t>
       </w:r>
     </w:p>
     <w:p>
       <w:pPr>
-        <w:keepNext/>
-        <w:spacing w:before="0" w:after="40"/>
+        <w:pStyle w:val="ListBullet"/>
+        <w:spacing w:before="0" w:after="20" w:line="260" w:lineRule="atLeast"/>
       </w:pPr>
       <w:r>
         <w:rPr>
-          <w:rFonts w:ascii="Calibri" w:hAnsi="Calibri"/>
+          <w:rFonts w:ascii="Calibri" w:hAnsi="Calibri" w:eastAsia="Calibri" w:cs="Calibri"/>
+          <w:b w:val="0"/>
+          <w:color w:val="000000"/>
+          <w:sz w:val="20"/>
+        </w:rPr>
+        <w:t>Acted as the team’s de facto technical lead: clarified tasks, set best practices, and helped teammates through implementation, which sped up onboarding.</w:t>
+      </w:r>
+    </w:p>
+    <w:p>
+      <w:pPr>
+        <w:spacing w:before="120" w:after="0" w:line="260" w:lineRule="atLeast"/>
+      </w:pPr>
+      <w:r>
+        <w:rPr>
+          <w:rFonts w:ascii="Calibri" w:hAnsi="Calibri" w:eastAsia="Calibri" w:cs="Calibri"/>
+          <w:b/>
+          <w:color w:val="000000"/>
+          <w:sz w:val="21"/>
+        </w:rPr>
+        <w:t>Contract Data Engineer</w:t>
+      </w:r>
+    </w:p>
+    <w:p>
+      <w:pPr>
+        <w:spacing w:before="0" w:after="20" w:line="260" w:lineRule="atLeast"/>
+      </w:pPr>
+      <w:r>
+        <w:rPr>
+          <w:rFonts w:ascii="Calibri" w:hAnsi="Calibri" w:eastAsia="Calibri" w:cs="Calibri"/>
+          <w:b w:val="0"/>
           <w:i/>
+          <w:color w:val="000000"/>
+          <w:sz w:val="20"/>
+        </w:rPr>
+        <w:t>Orlando, FL | 2025</w:t>
+      </w:r>
+    </w:p>
+    <w:p>
+      <w:pPr>
+        <w:pStyle w:val="ListBullet"/>
+        <w:spacing w:before="0" w:after="20" w:line="260" w:lineRule="atLeast"/>
+      </w:pPr>
+      <w:r>
+        <w:rPr>
+          <w:rFonts w:ascii="Calibri" w:hAnsi="Calibri" w:eastAsia="Calibri" w:cs="Calibri"/>
+          <w:b w:val="0"/>
+          <w:color w:val="000000"/>
+          <w:sz w:val="20"/>
+        </w:rPr>
+        <w:t>Engineered a production data pipeline using Tekla PowerFab APIs (C#), Python ETL, and AWS S3, automating ingestion of fabrication metrics into SQL Server and delivering a Power BI dashboard leadership uses to track daily production.</w:t>
+      </w:r>
+    </w:p>
+    <w:p>
+      <w:pPr>
+        <w:pStyle w:val="ListBullet"/>
+        <w:spacing w:before="0" w:after="20" w:line="260" w:lineRule="atLeast"/>
+      </w:pPr>
+      <w:r>
+        <w:rPr>
+          <w:rFonts w:ascii="Calibri" w:hAnsi="Calibri" w:eastAsia="Calibri" w:cs="Calibri"/>
+          <w:b w:val="0"/>
+          <w:color w:val="000000"/>
+          <w:sz w:val="20"/>
+        </w:rPr>
+        <w:t>Implemented Type 2 SCD tracking using dbt and Snowflake across 2M+ records, so the business could audit compliance and see how attributes changed over time.</w:t>
+      </w:r>
+    </w:p>
+    <w:p>
+      <w:pPr>
+        <w:spacing w:before="120" w:after="0" w:line="260" w:lineRule="atLeast"/>
+      </w:pPr>
+      <w:r>
+        <w:rPr>
+          <w:rFonts w:ascii="Calibri" w:hAnsi="Calibri" w:eastAsia="Calibri" w:cs="Calibri"/>
+          <w:b/>
+          <w:color w:val="000000"/>
+          <w:sz w:val="21"/>
+        </w:rPr>
+        <w:t>Senior Data Analyst, MasterCorp</w:t>
+      </w:r>
+    </w:p>
+    <w:p>
+      <w:pPr>
+        <w:spacing w:before="0" w:after="20" w:line="260" w:lineRule="atLeast"/>
+      </w:pPr>
+      <w:r>
+        <w:rPr>
+          <w:rFonts w:ascii="Calibri" w:hAnsi="Calibri" w:eastAsia="Calibri" w:cs="Calibri"/>
+          <w:b w:val="0"/>
+          <w:i/>
+          <w:color w:val="000000"/>
           <w:sz w:val="20"/>
         </w:rPr>
         <w:t>Orlando, FL | October 2023 – March 2025</w:t>
@@ -485,82 +708,72 @@
     <w:p>
       <w:pPr>
         <w:pStyle w:val="ListBullet"/>
-        <w:spacing w:after="40" w:before="0"/>
-        <w:ind w:left="360"/>
+        <w:spacing w:before="0" w:after="20" w:line="260" w:lineRule="atLeast"/>
       </w:pPr>
       <w:r>
         <w:rPr>
-          <w:rFonts w:ascii="Calibri" w:hAnsi="Calibri"/>
+          <w:rFonts w:ascii="Calibri" w:hAnsi="Calibri" w:eastAsia="Calibri" w:cs="Calibri"/>
+          <w:b w:val="0"/>
+          <w:color w:val="000000"/>
           <w:sz w:val="20"/>
         </w:rPr>
-        <w:t>Introduced and owned star-schema semantic models for finance, operations, HR, and legal; re-engineered core dimensions from Type 1 to Type 2 using surrogate keys and effective dating.</w:t>
+        <w:t>Introduced and owned star-schema semantic models across finance, operations, HR, and legal using surrogate keys and effective dating (SCD2), giving the company its first consistent cross-department reporting.</w:t>
       </w:r>
     </w:p>
     <w:p>
       <w:pPr>
         <w:pStyle w:val="ListBullet"/>
-        <w:spacing w:after="40" w:before="0"/>
-        <w:ind w:left="360"/>
+        <w:spacing w:before="0" w:after="20" w:line="260" w:lineRule="atLeast"/>
       </w:pPr>
       <w:r>
         <w:rPr>
-          <w:rFonts w:ascii="Calibri" w:hAnsi="Calibri"/>
+          <w:rFonts w:ascii="Calibri" w:hAnsi="Calibri" w:eastAsia="Calibri" w:cs="Calibri"/>
+          <w:b w:val="0"/>
+          <w:color w:val="000000"/>
           <w:sz w:val="20"/>
         </w:rPr>
-        <w:t>Designed the company's first enterprise HR analytics dashboard, formally defining turnover metrics across siloed departments; insights contributed to a 25% reduction in turnover via a cross-functional initiative.</w:t>
+        <w:t>Designed the company’s first enterprise HR analytics dashboard in Power BI and SQL and defined turnover metrics across siloed departments. Leadership used it in a cross-functional initiative that cut turnover 25%.</w:t>
       </w:r>
     </w:p>
     <w:p>
       <w:pPr>
         <w:pStyle w:val="ListBullet"/>
-        <w:spacing w:after="40" w:before="0"/>
-        <w:ind w:left="360"/>
+        <w:spacing w:before="0" w:after="20" w:line="260" w:lineRule="atLeast"/>
       </w:pPr>
       <w:r>
         <w:rPr>
-          <w:rFonts w:ascii="Calibri" w:hAnsi="Calibri"/>
+          <w:rFonts w:ascii="Calibri" w:hAnsi="Calibri" w:eastAsia="Calibri" w:cs="Calibri"/>
+          <w:b w:val="0"/>
+          <w:color w:val="000000"/>
           <w:sz w:val="20"/>
         </w:rPr>
-        <w:t>Built an Operations Financial Overview dashboard integrating financial, operational, and merit-based KPIs across 200+ sites, with automated bonus-calculation logic aligned to real-time performance.</w:t>
+        <w:t>Built an Operations Financial Overview dashboard using advanced DAX and SQL, evaluating 200+ sites on financial, operational, and merit-based KPIs with automated bonus-calculation logic.</w:t>
       </w:r>
     </w:p>
     <w:p>
       <w:pPr>
-        <w:pStyle w:val="ListBullet"/>
-        <w:spacing w:after="40" w:before="0"/>
-        <w:ind w:left="360"/>
+        <w:spacing w:before="120" w:after="0" w:line="260" w:lineRule="atLeast"/>
       </w:pPr>
       <w:r>
         <w:rPr>
-          <w:rFonts w:ascii="Calibri" w:hAnsi="Calibri"/>
-          <w:sz w:val="20"/>
+          <w:rFonts w:ascii="Calibri" w:hAnsi="Calibri" w:eastAsia="Calibri" w:cs="Calibri"/>
+          <w:b/>
+          <w:color w:val="000000"/>
+          <w:sz w:val="21"/>
         </w:rPr>
-        <w:t>Engineered a real-time Overtime &amp; Scheduling dashboard for 5,000+ associates across 200 sites, using advanced DAX to shift overtime management from reactive to proactive.</w:t>
+        <w:t>Financial Planning Analyst, Raymond James</w:t>
       </w:r>
     </w:p>
     <w:p>
       <w:pPr>
-        <w:keepNext/>
-        <w:spacing w:before="160" w:after="0"/>
+        <w:spacing w:before="0" w:after="20" w:line="260" w:lineRule="atLeast"/>
       </w:pPr>
       <w:r>
         <w:rPr>
-          <w:rFonts w:ascii="Calibri" w:hAnsi="Calibri"/>
-          <w:b/>
-          <w:sz w:val="21"/>
-        </w:rPr>
-        <w:t>Financial Planning Analyst — Raymond James</w:t>
-      </w:r>
-    </w:p>
-    <w:p>
-      <w:pPr>
-        <w:keepNext/>
-        <w:spacing w:before="0" w:after="40"/>
-      </w:pPr>
-      <w:r>
-        <w:rPr>
-          <w:rFonts w:ascii="Calibri" w:hAnsi="Calibri"/>
+          <w:rFonts w:ascii="Calibri" w:hAnsi="Calibri" w:eastAsia="Calibri" w:cs="Calibri"/>
+          <w:b w:val="0"/>
           <w:i/>
+          <w:color w:val="000000"/>
           <w:sz w:val="20"/>
         </w:rPr>
         <w:t>Orlando, FL | January 2022 – October 2023</w:t>
@@ -569,68 +782,57 @@
     <w:p>
       <w:pPr>
         <w:pStyle w:val="ListBullet"/>
-        <w:spacing w:after="40" w:before="0"/>
-        <w:ind w:left="360"/>
+        <w:spacing w:before="0" w:after="20" w:line="260" w:lineRule="atLeast"/>
       </w:pPr>
       <w:r>
         <w:rPr>
-          <w:rFonts w:ascii="Calibri" w:hAnsi="Calibri"/>
+          <w:rFonts w:ascii="Calibri" w:hAnsi="Calibri" w:eastAsia="Calibri" w:cs="Calibri"/>
+          <w:b w:val="0"/>
+          <w:color w:val="000000"/>
           <w:sz w:val="20"/>
         </w:rPr>
-        <w:t>Automated capital gains exposure monitoring by integrating BlackRock's API with SQL-driven holdings data, uncovering $50M in avoidable distributions and directly supporting regulatory compliance.</w:t>
+        <w:t>Automated capital gains exposure monitoring using BlackRock’s API integrated with SQL-driven holdings data, identifying and flagging $50M in avoidable distributions and shaping distribution strategy.</w:t>
       </w:r>
     </w:p>
     <w:p>
       <w:pPr>
         <w:pStyle w:val="ListBullet"/>
-        <w:spacing w:after="40" w:before="0"/>
-        <w:ind w:left="360"/>
+        <w:spacing w:before="0" w:after="20" w:line="260" w:lineRule="atLeast"/>
       </w:pPr>
       <w:r>
         <w:rPr>
-          <w:rFonts w:ascii="Calibri" w:hAnsi="Calibri"/>
+          <w:rFonts w:ascii="Calibri" w:hAnsi="Calibri" w:eastAsia="Calibri" w:cs="Calibri"/>
+          <w:b w:val="0"/>
+          <w:color w:val="000000"/>
           <w:sz w:val="20"/>
         </w:rPr>
-        <w:t>Developed and implemented 600+ data-driven financial plans in partnership with 100+ advisors, leveraging SQL to aggregate client data and ensure regulatory adherence.</w:t>
+        <w:t>Delivered 600+ regulatory-aligned financial plans for 100+ financial advisors, using SQL to check client holdings against compliance standards.</w:t>
       </w:r>
     </w:p>
     <w:p>
       <w:pPr>
-        <w:pStyle w:val="ListBullet"/>
-        <w:spacing w:after="40" w:before="0"/>
-        <w:ind w:left="360"/>
+        <w:spacing w:before="120" w:after="0" w:line="260" w:lineRule="atLeast"/>
       </w:pPr>
       <w:r>
         <w:rPr>
-          <w:rFonts w:ascii="Calibri" w:hAnsi="Calibri"/>
-          <w:sz w:val="20"/>
+          <w:rFonts w:ascii="Calibri" w:hAnsi="Calibri" w:eastAsia="Calibri" w:cs="Calibri"/>
+          <w:b/>
+          <w:color w:val="000000"/>
+          <w:sz w:val="21"/>
         </w:rPr>
-        <w:t>Scaled manual compliance review processes into automated, auditable workflows, strengthening regulatory exam readiness across the region.</w:t>
+        <w:t>Reporting Analyst, Universal Property &amp; Casualty Insurance</w:t>
       </w:r>
     </w:p>
     <w:p>
       <w:pPr>
-        <w:keepNext/>
-        <w:spacing w:before="160" w:after="0"/>
+        <w:spacing w:before="0" w:after="20" w:line="260" w:lineRule="atLeast"/>
       </w:pPr>
       <w:r>
         <w:rPr>
-          <w:rFonts w:ascii="Calibri" w:hAnsi="Calibri"/>
-          <w:b/>
-          <w:sz w:val="21"/>
-        </w:rPr>
-        <w:t>Reporting Analyst — Universal Property &amp; Casualty Insurance</w:t>
-      </w:r>
-    </w:p>
-    <w:p>
-      <w:pPr>
-        <w:keepNext/>
-        <w:spacing w:before="0" w:after="40"/>
-      </w:pPr>
-      <w:r>
-        <w:rPr>
-          <w:rFonts w:ascii="Calibri" w:hAnsi="Calibri"/>
+          <w:rFonts w:ascii="Calibri" w:hAnsi="Calibri" w:eastAsia="Calibri" w:cs="Calibri"/>
+          <w:b w:val="0"/>
           <w:i/>
+          <w:color w:val="000000"/>
           <w:sz w:val="20"/>
         </w:rPr>
         <w:t>Ft. Lauderdale, FL | January 2021 – January 2022</w:t>
@@ -639,54 +841,42 @@
     <w:p>
       <w:pPr>
         <w:pStyle w:val="ListBullet"/>
-        <w:spacing w:after="40" w:before="0"/>
-        <w:ind w:left="360"/>
+        <w:spacing w:before="0" w:after="20" w:line="260" w:lineRule="atLeast"/>
       </w:pPr>
       <w:r>
         <w:rPr>
-          <w:rFonts w:ascii="Calibri" w:hAnsi="Calibri"/>
+          <w:rFonts w:ascii="Calibri" w:hAnsi="Calibri" w:eastAsia="Calibri" w:cs="Calibri"/>
+          <w:b w:val="0"/>
+          <w:color w:val="000000"/>
           <w:sz w:val="20"/>
         </w:rPr>
-        <w:t>Built SQL queries and stored procedures generating recurring operational reports on claims and underwriting performance for finance and compliance teams.</w:t>
+        <w:t>Replaced manual regulatory reporting for claims and underwriting with SQL stored procedures, giving finance and compliance faster, more accurate reports.</w:t>
       </w:r>
     </w:p>
     <w:p>
       <w:pPr>
-        <w:pStyle w:val="ListBullet"/>
-        <w:spacing w:after="40" w:before="0"/>
-        <w:ind w:left="360"/>
+        <w:spacing w:before="120" w:after="0" w:line="260" w:lineRule="atLeast"/>
       </w:pPr>
       <w:r>
         <w:rPr>
-          <w:rFonts w:ascii="Calibri" w:hAnsi="Calibri"/>
-          <w:sz w:val="20"/>
+          <w:rFonts w:ascii="Calibri" w:hAnsi="Calibri" w:eastAsia="Calibri" w:cs="Calibri"/>
+          <w:b/>
+          <w:color w:val="000000"/>
+          <w:sz w:val="21"/>
         </w:rPr>
-        <w:t>Automated report delivery and validated outputs against source systems, improving accuracy across regulatory submissions.</w:t>
+        <w:t>Data Analyst &amp; Assistant Coach, Rollins College</w:t>
       </w:r>
     </w:p>
     <w:p>
       <w:pPr>
-        <w:keepNext/>
-        <w:spacing w:before="160" w:after="0"/>
+        <w:spacing w:before="0" w:after="20" w:line="260" w:lineRule="atLeast"/>
       </w:pPr>
       <w:r>
         <w:rPr>
-          <w:rFonts w:ascii="Calibri" w:hAnsi="Calibri"/>
-          <w:b/>
-          <w:sz w:val="21"/>
-        </w:rPr>
-        <w:t>Data Analyst &amp; Assistant Coach — Rollins College</w:t>
-      </w:r>
-    </w:p>
-    <w:p>
-      <w:pPr>
-        <w:keepNext/>
-        <w:spacing w:before="0" w:after="40"/>
-      </w:pPr>
-      <w:r>
-        <w:rPr>
-          <w:rFonts w:ascii="Calibri" w:hAnsi="Calibri"/>
+          <w:rFonts w:ascii="Calibri" w:hAnsi="Calibri" w:eastAsia="Calibri" w:cs="Calibri"/>
+          <w:b w:val="0"/>
           <w:i/>
+          <w:color w:val="000000"/>
           <w:sz w:val="20"/>
         </w:rPr>
         <w:t>Orlando, FL | August 2018 – January 2022</w:t>
@@ -695,44 +885,157 @@
     <w:p>
       <w:pPr>
         <w:pStyle w:val="ListBullet"/>
-        <w:spacing w:after="40" w:before="0"/>
-        <w:ind w:left="360"/>
+        <w:spacing w:before="0" w:after="20" w:line="260" w:lineRule="atLeast"/>
       </w:pPr>
       <w:r>
         <w:rPr>
-          <w:rFonts w:ascii="Calibri" w:hAnsi="Calibri"/>
+          <w:rFonts w:ascii="Calibri" w:hAnsi="Calibri" w:eastAsia="Calibri" w:cs="Calibri"/>
+          <w:b w:val="0"/>
+          <w:color w:val="000000"/>
           <w:sz w:val="20"/>
         </w:rPr>
-        <w:t>Built a SQL database centralizing player performance, TrackMan telemetry, and tournament data — enabling granular trend analysis across seasons.</w:t>
+        <w:t>Built a SQL database centralizing player performance, TrackMan telemetry, and tournament data, and optimized practice schedules with linear programming, which raised attendance 50%.</w:t>
       </w:r>
     </w:p>
     <w:p>
       <w:pPr>
-        <w:pStyle w:val="ListBullet"/>
-        <w:spacing w:after="40" w:before="0"/>
-        <w:ind w:left="360"/>
-      </w:pPr>
-      <w:r>
-        <w:rPr>
-          <w:rFonts w:ascii="Calibri" w:hAnsi="Calibri"/>
-          <w:sz w:val="20"/>
-        </w:rPr>
-        <w:t>Optimized practice schedules using linear programming, increasing attendance by 50%.</w:t>
-      </w:r>
-    </w:p>
-    <w:p>
-      <w:pPr>
-        <w:keepNext/>
-        <w:spacing w:before="200" w:after="80"/>
+        <w:pStyle w:val="Heading2"/>
+        <w:spacing w:before="200" w:after="80" w:line="260" w:lineRule="atLeast"/>
         <w:pBdr>
           <w:bottom w:val="single" w:sz="4" w:space="1" w:color="2F4B4F"/>
         </w:pBdr>
       </w:pPr>
       <w:r>
         <w:rPr>
-          <w:rFonts w:ascii="Calibri" w:hAnsi="Calibri"/>
+          <w:rFonts w:ascii="Calibri" w:hAnsi="Calibri" w:eastAsia="Calibri" w:cs="Calibri"/>
           <w:b/>
-          <w:color w:val="2F4B4F"/>
+          <w:color w:val="000000"/>
+          <w:sz w:val="24"/>
+        </w:rPr>
+        <w:t>PROJECTS</w:t>
+      </w:r>
+    </w:p>
+    <w:p>
+      <w:pPr>
+        <w:spacing w:before="120" w:after="0" w:line="260" w:lineRule="atLeast"/>
+      </w:pPr>
+      <w:r>
+        <w:rPr>
+          <w:rFonts w:ascii="Calibri" w:hAnsi="Calibri" w:eastAsia="Calibri" w:cs="Calibri"/>
+          <w:b/>
+          <w:color w:val="000000"/>
+          <w:sz w:val="21"/>
+        </w:rPr>
+        <w:t>Shots Gained Tracker</w:t>
+      </w:r>
+      <w:r>
+        <w:rPr>
+          <w:rFonts w:ascii="Calibri" w:hAnsi="Calibri" w:eastAsia="Calibri" w:cs="Calibri"/>
+          <w:b w:val="0"/>
+          <w:i/>
+          <w:color w:val="000000"/>
+          <w:sz w:val="20"/>
+        </w:rPr>
+        <w:t>, React 19, TypeScript, Express, Azure SQL, PWA, IndexedDB</w:t>
+      </w:r>
+    </w:p>
+    <w:p>
+      <w:pPr>
+        <w:pStyle w:val="ListBullet"/>
+        <w:spacing w:before="0" w:after="20" w:line="260" w:lineRule="atLeast"/>
+      </w:pPr>
+      <w:r>
+        <w:rPr>
+          <w:rFonts w:ascii="Calibri" w:hAnsi="Calibri" w:eastAsia="Calibri" w:cs="Calibri"/>
+          <w:b w:val="0"/>
+          <w:color w:val="000000"/>
+          <w:sz w:val="20"/>
+        </w:rPr>
+        <w:t>Built a mobile-first PWA in React 19, TypeScript, and Express on Azure SQL for live strokes gained tracking against ~3,500 PGA Tour benchmarks, with running totals by category (Driving, Approach, Short Game, Putting).</w:t>
+      </w:r>
+    </w:p>
+    <w:p>
+      <w:pPr>
+        <w:pStyle w:val="ListBullet"/>
+        <w:spacing w:before="0" w:after="20" w:line="260" w:lineRule="atLeast"/>
+      </w:pPr>
+      <w:r>
+        <w:rPr>
+          <w:rFonts w:ascii="Calibri" w:hAnsi="Calibri" w:eastAsia="Calibri" w:cs="Calibri"/>
+          <w:b w:val="0"/>
+          <w:color w:val="000000"/>
+          <w:sz w:val="20"/>
+        </w:rPr>
+        <w:t>Designed an offline-first architecture with IndexedDB and Workbox service workers: cached benchmarks let you log rounds and calculate SG without signal, and a sync queue uploads them when you reconnect.</w:t>
+      </w:r>
+    </w:p>
+    <w:p>
+      <w:pPr>
+        <w:spacing w:before="120" w:after="0" w:line="260" w:lineRule="atLeast"/>
+      </w:pPr>
+      <w:r>
+        <w:rPr>
+          <w:rFonts w:ascii="Calibri" w:hAnsi="Calibri" w:eastAsia="Calibri" w:cs="Calibri"/>
+          <w:b/>
+          <w:color w:val="000000"/>
+          <w:sz w:val="21"/>
+        </w:rPr>
+        <w:t>Blast Motion Putting Pipeline</w:t>
+      </w:r>
+      <w:r>
+        <w:rPr>
+          <w:rFonts w:ascii="Calibri" w:hAnsi="Calibri" w:eastAsia="Calibri" w:cs="Calibri"/>
+          <w:b w:val="0"/>
+          <w:i/>
+          <w:color w:val="000000"/>
+          <w:sz w:val="20"/>
+        </w:rPr>
+        <w:t>, Python, Azure Functions, Azure SQL, Power Automate, Power BI</w:t>
+      </w:r>
+    </w:p>
+    <w:p>
+      <w:pPr>
+        <w:pStyle w:val="ListBullet"/>
+        <w:spacing w:before="0" w:after="20" w:line="260" w:lineRule="atLeast"/>
+      </w:pPr>
+      <w:r>
+        <w:rPr>
+          <w:rFonts w:ascii="Calibri" w:hAnsi="Calibri" w:eastAsia="Calibri" w:cs="Calibri"/>
+          <w:b w:val="0"/>
+          <w:color w:val="000000"/>
+          <w:sz w:val="20"/>
+        </w:rPr>
+        <w:t>Engineered a serverless ETL pipeline using Azure Functions (timer + HTTP triggers) and Python, extracting putting stroke data from Blast Motion’s REST API and loading it into Azure SQL with a high-watermark pattern and idempotent upserts.</w:t>
+      </w:r>
+    </w:p>
+    <w:p>
+      <w:pPr>
+        <w:pStyle w:val="ListBullet"/>
+        <w:spacing w:before="0" w:after="20" w:line="260" w:lineRule="atLeast"/>
+      </w:pPr>
+      <w:r>
+        <w:rPr>
+          <w:rFonts w:ascii="Calibri" w:hAnsi="Calibri" w:eastAsia="Calibri" w:cs="Calibri"/>
+          <w:b w:val="0"/>
+          <w:color w:val="000000"/>
+          <w:sz w:val="20"/>
+        </w:rPr>
+        <w:t>Built a one-tap Power Automate workflow that runs the pipeline, refreshes the dataset, and sends a push notification, getting new putts onto the dashboard in under 60 seconds.</w:t>
+      </w:r>
+    </w:p>
+    <w:p>
+      <w:pPr>
+        <w:pStyle w:val="Heading2"/>
+        <w:spacing w:before="200" w:after="80" w:line="260" w:lineRule="atLeast"/>
+        <w:pBdr>
+          <w:bottom w:val="single" w:sz="4" w:space="1" w:color="2F4B4F"/>
+        </w:pBdr>
+      </w:pPr>
+      <w:r>
+        <w:rPr>
+          <w:rFonts w:ascii="Calibri" w:hAnsi="Calibri" w:eastAsia="Calibri" w:cs="Calibri"/>
+          <w:b/>
+          <w:color w:val="000000"/>
           <w:sz w:val="24"/>
         </w:rPr>
         <w:t>EDUCATION</w:t>
@@ -740,37 +1043,40 @@
     </w:p>
     <w:p>
       <w:pPr>
-        <w:spacing w:after="40"/>
+        <w:spacing w:before="0" w:after="40" w:line="260" w:lineRule="atLeast"/>
       </w:pPr>
       <w:r>
         <w:rPr>
-          <w:rFonts w:ascii="Calibri" w:hAnsi="Calibri"/>
+          <w:rFonts w:ascii="Calibri" w:hAnsi="Calibri" w:eastAsia="Calibri" w:cs="Calibri"/>
           <w:b/>
-          <w:sz w:val="21"/>
+          <w:color w:val="000000"/>
+          <w:sz w:val="20"/>
         </w:rPr>
         <w:t>Bachelor of Arts in Mathematics</w:t>
       </w:r>
       <w:r>
         <w:rPr>
-          <w:rFonts w:ascii="Calibri" w:hAnsi="Calibri"/>
-          <w:sz w:val="21"/>
+          <w:rFonts w:ascii="Calibri" w:hAnsi="Calibri" w:eastAsia="Calibri" w:cs="Calibri"/>
+          <w:b w:val="0"/>
+          <w:color w:val="000000"/>
+          <w:sz w:val="20"/>
         </w:rPr>
-        <w:t xml:space="preserve"> — Rollins College, Orlando, FL (May 2017)</w:t>
+        <w:t>, Rollins College, Orlando, FL (May 2018)</w:t>
       </w:r>
     </w:p>
     <w:p>
       <w:pPr>
-        <w:keepNext/>
-        <w:spacing w:before="200" w:after="80"/>
+        <w:pStyle w:val="Heading2"/>
+        <w:spacing w:before="200" w:after="80" w:line="260" w:lineRule="atLeast"/>
         <w:pBdr>
           <w:bottom w:val="single" w:sz="4" w:space="1" w:color="2F4B4F"/>
         </w:pBdr>
       </w:pPr>
       <w:r>
         <w:rPr>
-          <w:rFonts w:ascii="Calibri" w:hAnsi="Calibri"/>
+          <w:rFonts w:ascii="Calibri" w:hAnsi="Calibri" w:eastAsia="Calibri" w:cs="Calibri"/>
           <w:b/>
-          <w:color w:val="2F4B4F"/>
+          <w:color w:val="000000"/>
           <w:sz w:val="24"/>
         </w:rPr>
         <w:t>CERTIFICATIONS</w:t>
@@ -779,12 +1085,13 @@
     <w:p>
       <w:pPr>
         <w:pStyle w:val="ListBullet"/>
-        <w:spacing w:after="40" w:before="0"/>
-        <w:ind w:left="360"/>
+        <w:spacing w:before="0" w:after="20" w:line="260" w:lineRule="atLeast"/>
       </w:pPr>
       <w:r>
         <w:rPr>
-          <w:rFonts w:ascii="Calibri" w:hAnsi="Calibri"/>
+          <w:rFonts w:ascii="Calibri" w:hAnsi="Calibri" w:eastAsia="Calibri" w:cs="Calibri"/>
+          <w:b w:val="0"/>
+          <w:color w:val="000000"/>
           <w:sz w:val="20"/>
         </w:rPr>
         <w:t>Microsoft DP-600: Fabric Analytics Engineer</w:t>
@@ -793,12 +1100,13 @@
     <w:p>
       <w:pPr>
         <w:pStyle w:val="ListBullet"/>
-        <w:spacing w:after="40" w:before="0"/>
-        <w:ind w:left="360"/>
+        <w:spacing w:before="0" w:after="20" w:line="260" w:lineRule="atLeast"/>
       </w:pPr>
       <w:r>
         <w:rPr>
-          <w:rFonts w:ascii="Calibri" w:hAnsi="Calibri"/>
+          <w:rFonts w:ascii="Calibri" w:hAnsi="Calibri" w:eastAsia="Calibri" w:cs="Calibri"/>
+          <w:b w:val="0"/>
+          <w:color w:val="000000"/>
           <w:sz w:val="20"/>
         </w:rPr>
         <w:t>AWS Solutions Architect Associate</w:t>
@@ -807,12 +1115,13 @@
     <w:p>
       <w:pPr>
         <w:pStyle w:val="ListBullet"/>
-        <w:spacing w:after="40" w:before="0"/>
-        <w:ind w:left="360"/>
+        <w:spacing w:before="0" w:after="20" w:line="260" w:lineRule="atLeast"/>
       </w:pPr>
       <w:r>
         <w:rPr>
-          <w:rFonts w:ascii="Calibri" w:hAnsi="Calibri"/>
+          <w:rFonts w:ascii="Calibri" w:hAnsi="Calibri" w:eastAsia="Calibri" w:cs="Calibri"/>
+          <w:b w:val="0"/>
+          <w:color w:val="000000"/>
           <w:sz w:val="20"/>
         </w:rPr>
         <w:t>Microsoft PL-300: Power BI Data Analyst Associate</w:t>
@@ -821,12 +1130,13 @@
     <w:p>
       <w:pPr>
         <w:pStyle w:val="ListBullet"/>
-        <w:spacing w:after="40" w:before="0"/>
-        <w:ind w:left="360"/>
+        <w:spacing w:before="0" w:after="20" w:line="260" w:lineRule="atLeast"/>
       </w:pPr>
       <w:r>
         <w:rPr>
-          <w:rFonts w:ascii="Calibri" w:hAnsi="Calibri"/>
+          <w:rFonts w:ascii="Calibri" w:hAnsi="Calibri" w:eastAsia="Calibri" w:cs="Calibri"/>
+          <w:b w:val="0"/>
+          <w:color w:val="000000"/>
           <w:sz w:val="20"/>
         </w:rPr>
         <w:t>Microsoft AZ-900: Azure Cloud Fundamentals</w:t>
@@ -835,12 +1145,13 @@
     <w:p>
       <w:pPr>
         <w:pStyle w:val="ListBullet"/>
-        <w:spacing w:after="40" w:before="0"/>
-        <w:ind w:left="360"/>
+        <w:spacing w:before="0" w:after="20" w:line="260" w:lineRule="atLeast"/>
       </w:pPr>
       <w:r>
         <w:rPr>
-          <w:rFonts w:ascii="Calibri" w:hAnsi="Calibri"/>
+          <w:rFonts w:ascii="Calibri" w:hAnsi="Calibri" w:eastAsia="Calibri" w:cs="Calibri"/>
+          <w:b w:val="0"/>
+          <w:color w:val="000000"/>
           <w:sz w:val="20"/>
         </w:rPr>
         <w:t>Google Advanced Data Analytics Professional Certificate</w:t>
@@ -1219,13 +1530,10 @@
     <w:name w:val="Normal"/>
     <w:qFormat/>
     <w:rsid w:val="00FC693F"/>
-    <w:pPr>
-      <w:spacing w:after="40" w:before="0"/>
-    </w:pPr>
     <w:rPr>
       <w:rFonts w:ascii="Calibri" w:hAnsi="Calibri"/>
-      <w:color w:val="1A1A1A"/>
-      <w:sz w:val="21"/>
+      <w:color w:val="000000"/>
+      <w:sz w:val="20"/>
     </w:rPr>
   </w:style>
   <w:style w:type="paragraph" w:styleId="Header">
@@ -1287,10 +1595,10 @@
       <w:outlineLvl w:val="0"/>
     </w:pPr>
     <w:rPr>
-      <w:rFonts w:asciiTheme="majorHAnsi" w:eastAsiaTheme="majorEastAsia" w:hAnsiTheme="majorHAnsi" w:cstheme="majorBidi"/>
+      <w:rFonts w:asciiTheme="majorHAnsi" w:eastAsiaTheme="majorEastAsia" w:hAnsiTheme="majorHAnsi" w:cstheme="majorBidi" w:ascii="Calibri" w:hAnsi="Calibri"/>
       <w:b/>
       <w:bCs/>
-      <w:color w:val="365F91" w:themeColor="accent1" w:themeShade="BF"/>
+      <w:color w:val="000000"/>
       <w:sz w:val="28"/>
       <w:szCs w:val="28"/>
     </w:rPr>
@@ -1311,11 +1619,12 @@
       <w:outlineLvl w:val="1"/>
     </w:pPr>
     <w:rPr>
-      <w:rFonts w:asciiTheme="majorHAnsi" w:eastAsiaTheme="majorEastAsia" w:hAnsiTheme="majorHAnsi" w:cstheme="majorBidi"/>
+      <w:rFonts w:asciiTheme="majorHAnsi" w:eastAsiaTheme="majorEastAsia" w:hAnsiTheme="majorHAnsi" w:cstheme="majorBidi" w:ascii="Calibri" w:hAnsi="Calibri"/>
       <w:b/>
       <w:bCs/>
-      <w:color w:val="4F81BD" w:themeColor="accent1"/>
-      <w:sz w:val="26"/>
+      <w:caps w:val="0"/>
+      <w:color w:val="000000"/>
+      <w:sz w:val="24"/>
       <w:szCs w:val="26"/>
     </w:rPr>
   </w:style>
@@ -1756,6 +2065,11 @@
       </w:numPr>
       <w:contextualSpacing/>
     </w:pPr>
+    <w:rPr>
+      <w:rFonts w:ascii="Calibri" w:hAnsi="Calibri"/>
+      <w:color w:val="000000"/>
+      <w:sz w:val="20"/>
+    </w:rPr>
   </w:style>
   <w:style w:type="paragraph" w:styleId="ListBullet2">
     <w:name w:val="List Bullet 2"/>

</xml_diff>